<commit_message>
style(docs): enforce black text policy for Word outputs
</commit_message>
<xml_diff>
--- a/docs/lab1/source/计算机23-2_231002208_戚晋瑜_实验一_AIRecord_v1.0.docx
+++ b/docs/lab1/source/计算机23-2_231002208_戚晋瑜_实验一_AIRecord_v1.0.docx
@@ -2546,7 +2546,7 @@
       <w:rFonts w:asciiTheme="majorHAnsi" w:eastAsiaTheme="majorEastAsia" w:hAnsiTheme="majorHAnsi" w:cstheme="majorBidi" w:ascii="黑体" w:hAnsi="黑体" w:eastAsia="黑体"/>
       <w:b/>
       <w:bCs/>
-      <w:color w:val="365F91" w:themeColor="accent1" w:themeShade="BF"/>
+      <w:color w:val="000000"/>
       <w:sz w:val="32"/>
       <w:szCs w:val="28"/>
     </w:rPr>
@@ -2570,7 +2570,7 @@
       <w:rFonts w:asciiTheme="majorHAnsi" w:eastAsiaTheme="majorEastAsia" w:hAnsiTheme="majorHAnsi" w:cstheme="majorBidi" w:ascii="黑体" w:hAnsi="黑体" w:eastAsia="黑体"/>
       <w:b/>
       <w:bCs/>
-      <w:color w:val="4F81BD" w:themeColor="accent1"/>
+      <w:color w:val="000000"/>
       <w:sz w:val="28"/>
       <w:szCs w:val="26"/>
     </w:rPr>
@@ -2594,7 +2594,7 @@
       <w:rFonts w:asciiTheme="majorHAnsi" w:eastAsiaTheme="majorEastAsia" w:hAnsiTheme="majorHAnsi" w:cstheme="majorBidi" w:ascii="黑体" w:hAnsi="黑体" w:eastAsia="黑体"/>
       <w:b/>
       <w:bCs/>
-      <w:color w:val="4F81BD" w:themeColor="accent1"/>
+      <w:color w:val="000000"/>
       <w:sz w:val="24"/>
     </w:rPr>
   </w:style>
@@ -2834,7 +2834,7 @@
     </w:pPr>
     <w:rPr>
       <w:rFonts w:asciiTheme="majorHAnsi" w:eastAsiaTheme="majorEastAsia" w:hAnsiTheme="majorHAnsi" w:cstheme="majorBidi" w:ascii="黑体" w:hAnsi="黑体" w:eastAsia="黑体"/>
-      <w:color w:val="17365D" w:themeColor="text2" w:themeShade="BF"/>
+      <w:color w:val="000000"/>
       <w:spacing w:val="5"/>
       <w:kern w:val="28"/>
       <w:sz w:val="36"/>

</xml_diff>